<commit_message>
Add POS_CASH/credit_card/installments features, closing out feature engineering
Extends src/feature_engineering.py with three more aggregations:
- POS_CASH_balance.csv (POS/cash loan installment status)
- credit_card_balance.csv (credit card balance, drawings, utilization)
- installments_payments.csv (actual vs. scheduled installment payments)

All three carry SK_ID_CURR directly, so no SK_ID_PREV rollup was needed
after all -- simpler than anticipated. AUC improves further: logistic
0.7487->0.7530 (+0.0043), LightGBM 0.7709->0.7821 (+0.0112). Cumulative
gain over the application_train-only MVP: logistic +0.0102, LightGBM
+0.0216. INSTAL_DPD_MEAN (installment delinquency) lands as the #4 SHAP
feature overall, right after the three EXT_SOURCE variables -- the
strongest new signal added. Adds 6 unit tests for the new aggregations
(21 total) and regenerates REPORT.md, dashboard.db, and the docx summary.

Co-Authored-By: Claude Sonnet 5 <noreply@anthropic.com>
</commit_message>
<xml_diff>
--- a/outputs/credit_risk_scorecard_summary.docx
+++ b/outputs/credit_risk_scorecard_summary.docx
@@ -155,7 +155,7 @@
           </w:tcPr>
           <w:p>
             <w:r>
-              <w:t xml:space="preserve">0.7487</w:t>
+              <w:t xml:space="preserve">0.7530</w:t>
             </w:r>
           </w:p>
         </w:tc>
@@ -165,7 +165,7 @@
           </w:tcPr>
           <w:p>
             <w:r>
-              <w:t xml:space="preserve">0.3752</w:t>
+              <w:t xml:space="preserve">0.3805</w:t>
             </w:r>
           </w:p>
         </w:tc>
@@ -175,7 +175,7 @@
           </w:tcPr>
           <w:p>
             <w:r>
-              <w:t xml:space="preserve">0.4973</w:t>
+              <w:t xml:space="preserve">0.5061</w:t>
             </w:r>
           </w:p>
         </w:tc>
@@ -197,7 +197,7 @@
           </w:tcPr>
           <w:p>
             <w:r>
-              <w:t xml:space="preserve">0.7709</w:t>
+              <w:t xml:space="preserve">0.7821</w:t>
             </w:r>
           </w:p>
         </w:tc>
@@ -207,7 +207,7 @@
           </w:tcPr>
           <w:p>
             <w:r>
-              <w:t xml:space="preserve">0.4057</w:t>
+              <w:t xml:space="preserve">0.4281</w:t>
             </w:r>
           </w:p>
         </w:tc>
@@ -217,7 +217,7 @@
           </w:tcPr>
           <w:p>
             <w:r>
-              <w:t xml:space="preserve">0.5417</w:t>
+              <w:t xml:space="preserve">0.5643</w:t>
             </w:r>
           </w:p>
         </w:tc>
@@ -242,7 +242,7 @@
         <w:spacing w:after="120"/>
       </w:pPr>
       <w:r>
-        <w:t xml:space="preserve">단순히 성능이 더 높은 모델을 채택하지 않고, 사전에 정의한 임계값(AUC +0.01pt)을 기준으로 판단했습니다. LightGBM이 베이스라인 로지스틱 스코어카드 대비 AUC를 +2.22%p(절대값 0.0222) 개선했고, 이는 기준치를 상회하여 "LightGBM (고도화 모델)"을 챔피언 모델로 채택했습니다. 기준에 미달했다면 해석 가능성이 높은 로지스틱 스코어카드를 유지하는 방향으로 설계했습니다.</w:t>
+        <w:t xml:space="preserve">단순히 성능이 더 높은 모델을 채택하지 않고, 사전에 정의한 임계값(AUC +0.01pt)을 기준으로 판단했습니다. LightGBM이 베이스라인 로지스틱 스코어카드 대비 AUC를 +2.91%p(절대값 0.0291) 개선했고, 이는 기준치를 상회하여 "LightGBM (고도화 모델)"을 챔피언 모델로 채택했습니다. 기준에 미달했다면 해석 가능성이 높은 로지스틱 스코어카드를 유지하는 방향으로 설계했습니다.</w:t>
       </w:r>
     </w:p>
     <w:p>
@@ -369,17 +369,17 @@
           </w:tcPr>
           <w:p>
             <w:r>
-              <w:t xml:space="preserve">605.0</w:t>
-            </w:r>
-          </w:p>
-        </w:tc>
-        <w:tc>
-          <w:tcPr>
-            <w:tcW w:type="dxa" w:w="2500"/>
-          </w:tcPr>
-          <w:p>
-            <w:r>
-              <w:t xml:space="preserve">0.67%</w:t>
+              <w:t xml:space="preserve">606.9</w:t>
+            </w:r>
+          </w:p>
+        </w:tc>
+        <w:tc>
+          <w:tcPr>
+            <w:tcW w:type="dxa" w:w="2500"/>
+          </w:tcPr>
+          <w:p>
+            <w:r>
+              <w:t xml:space="preserve">0.64%</w:t>
             </w:r>
           </w:p>
         </w:tc>
@@ -411,17 +411,17 @@
           </w:tcPr>
           <w:p>
             <w:r>
-              <w:t xml:space="preserve">586.4</w:t>
-            </w:r>
-          </w:p>
-        </w:tc>
-        <w:tc>
-          <w:tcPr>
-            <w:tcW w:type="dxa" w:w="2500"/>
-          </w:tcPr>
-          <w:p>
-            <w:r>
-              <w:t xml:space="preserve">1.81%</w:t>
+              <w:t xml:space="preserve">587.9</w:t>
+            </w:r>
+          </w:p>
+        </w:tc>
+        <w:tc>
+          <w:tcPr>
+            <w:tcW w:type="dxa" w:w="2500"/>
+          </w:tcPr>
+          <w:p>
+            <w:r>
+              <w:t xml:space="preserve">1.70%</w:t>
             </w:r>
           </w:p>
         </w:tc>
@@ -453,17 +453,17 @@
           </w:tcPr>
           <w:p>
             <w:r>
-              <w:t xml:space="preserve">572.0</w:t>
-            </w:r>
-          </w:p>
-        </w:tc>
-        <w:tc>
-          <w:tcPr>
-            <w:tcW w:type="dxa" w:w="2500"/>
-          </w:tcPr>
-          <w:p>
-            <w:r>
-              <w:t xml:space="preserve">3.97%</w:t>
+              <w:t xml:space="preserve">573.4</w:t>
+            </w:r>
+          </w:p>
+        </w:tc>
+        <w:tc>
+          <w:tcPr>
+            <w:tcW w:type="dxa" w:w="2500"/>
+          </w:tcPr>
+          <w:p>
+            <w:r>
+              <w:t xml:space="preserve">3.56%</w:t>
             </w:r>
           </w:p>
         </w:tc>
@@ -495,17 +495,17 @@
           </w:tcPr>
           <w:p>
             <w:r>
-              <w:t xml:space="preserve">555.4</w:t>
-            </w:r>
-          </w:p>
-        </w:tc>
-        <w:tc>
-          <w:tcPr>
-            <w:tcW w:type="dxa" w:w="2500"/>
-          </w:tcPr>
-          <w:p>
-            <w:r>
-              <w:t xml:space="preserve">8.31%</w:t>
+              <w:t xml:space="preserve">556.3</w:t>
+            </w:r>
+          </w:p>
+        </w:tc>
+        <w:tc>
+          <w:tcPr>
+            <w:tcW w:type="dxa" w:w="2500"/>
+          </w:tcPr>
+          <w:p>
+            <w:r>
+              <w:t xml:space="preserve">7.94%</w:t>
             </w:r>
           </w:p>
         </w:tc>
@@ -537,17 +537,17 @@
           </w:tcPr>
           <w:p>
             <w:r>
-              <w:t xml:space="preserve">526.3</w:t>
-            </w:r>
-          </w:p>
-        </w:tc>
-        <w:tc>
-          <w:tcPr>
-            <w:tcW w:type="dxa" w:w="2500"/>
-          </w:tcPr>
-          <w:p>
-            <w:r>
-              <w:t xml:space="preserve">25.60%</w:t>
+              <w:t xml:space="preserve">525.3</w:t>
+            </w:r>
+          </w:p>
+        </w:tc>
+        <w:tc>
+          <w:tcPr>
+            <w:tcW w:type="dxa" w:w="2500"/>
+          </w:tcPr>
+          <w:p>
+            <w:r>
+              <w:t xml:space="preserve">26.51%</w:t>
             </w:r>
           </w:p>
         </w:tc>
@@ -563,7 +563,7 @@
         <w:spacing w:after="120"/>
       </w:pPr>
       <w:r>
-        <w:t xml:space="preserve">A등급과 E등급의 실제 부도율 차이는 약 38.2배로, 등급 체계가 실제 위험도를 잘 분리하고 있음을 확인했습니다.</w:t>
+        <w:t xml:space="preserve">A등급과 E등급의 실제 부도율 차이는 약 41.4배로, 등급 체계가 실제 위험도를 잘 분리하고 있음을 확인했습니다.</w:t>
       </w:r>
     </w:p>
     <w:p>
@@ -580,7 +580,7 @@
         <w:spacing w:after="120"/>
       </w:pPr>
       <w:r>
-        <w:t xml:space="preserve">컷오프 점수 572.1점(승인율 50%) 기준, 예상 부도율 1.62%, 예상 손실률 0.73%(LGD 45% 가정)로 나타났습니다. 승인율과 리스크 간 트레이드오프를 정량적으로 제시해, 심사 정책 결정에 바로 활용 가능한 형태로 구성했습니다.</w:t>
+        <w:t xml:space="preserve">컷오프 점수 573.4점(승인율 50%) 기준, 예상 부도율 1.53%, 예상 손실률 0.69%(LGD 45% 가정)로 나타났습니다. 승인율과 리스크 간 트레이드오프를 정량적으로 제시해, 심사 정책 결정에 바로 활용 가능한 형태로 구성했습니다.</w:t>
       </w:r>
     </w:p>
     <w:p>
@@ -597,7 +597,7 @@
         <w:spacing w:after="120"/>
       </w:pPr>
       <w:r>
-        <w:t xml:space="preserve">Train/Test 간 스코어 분포 PSI = 0.0004 (train↔test, 안정). 표준 해석 기준(&lt;0.1 안정)에 따라 모델이 데이터 분포 변화에 안정적임을 정량적으로 검증했습니다.</w:t>
+        <w:t xml:space="preserve">Train/Test 간 스코어 분포 PSI = 0.0002 (train↔test, 안정). 표준 해석 기준(&lt;0.1 안정)에 따라 모델이 데이터 분포 변화에 안정적임을 정량적으로 검증했습니다.</w:t>
       </w:r>
     </w:p>
     <w:p>
@@ -679,7 +679,7 @@
         <w:ind w:left="200"/>
       </w:pPr>
       <w:r>
-        <w:t xml:space="preserve">Home Credit Default Risk 데이터 307,511건을 활용해 여신심사 스코어카드 파이프라인을 직접 설계·구현했습니다. WoE/IV 기반 변수 선별로 로지스틱 베이스라인 스코어카드(AUC 0.7487)를 만들고, LightGBM으로 고도화하여 AUC 0.7709(+2.22%p)를 달성했습니다. 단순 성능 비교가 아니라 사전에 정의한 채택 기준에 따라 챔피언 모델을 결정했고, PDO 점수 스케일링과 A-E 등급 설계, 컷오프 시뮬레이션으로 승인율-리스크 트레이드오프를 정량화했으며, PSI로 모델 안정성까지 점검해 실무 여신심사 프로세스를 엔드투엔드로 재현했습니다.</w:t>
+        <w:t xml:space="preserve">Home Credit Default Risk 데이터 307,511건을 활용해 여신심사 스코어카드 파이프라인을 직접 설계·구현했습니다. WoE/IV 기반 변수 선별로 로지스틱 베이스라인 스코어카드(AUC 0.7530)를 만들고, LightGBM으로 고도화하여 AUC 0.7821(+2.91%p)를 달성했습니다. 단순 성능 비교가 아니라 사전에 정의한 채택 기준에 따라 챔피언 모델을 결정했고, PDO 점수 스케일링과 A-E 등급 설계, 컷오프 시뮬레이션으로 승인율-리스크 트레이드오프를 정량화했으며, PSI로 모델 안정성까지 점검해 실무 여신심사 프로세스를 엔드투엔드로 재현했습니다.</w:t>
       </w:r>
     </w:p>
     <w:p>

</xml_diff>